<commit_message>
Publicar sitio (matriz + calculadora de zapatas) 3d09dc8e4e15e90fa21b7fd24f866f744ae60174
</commit_message>
<xml_diff>
--- a/entregables/Matriz-Contenido-Noviembre-2026-DMA.docx
+++ b/entregables/Matriz-Contenido-Noviembre-2026-DMA.docx
@@ -417,7 +417,7 @@
                 <w:sz w:val="18"/>
                 <w:szCs w:val="18"/>
               </w:rPr>
-              <w:t xml:space="preserve">Editar las 4 chuletas (perfiles de acero, cerchas, LOD, uniones) con el mismo formato de los reels del 19 y 20-oct que funcionaron. Gabriel revisa cada lámina técnica antes de publicar.</w:t>
+              <w:t xml:space="preserve">Editar las 4 chuletas (perfiles de acero, cerchas, LOD, uniones) con los formatos de los reels del 19 y 20-oct que funcionaron: la 1, la 3 y la 4 como «Simbología de niveles» (lista visual sin voz) y la 2 como «5 tipos de cimentación» (pizarra con voz). Gabriel revisa cada lámina técnica antes de publicar.</w:t>
             </w:r>
           </w:p>
         </w:tc>
@@ -533,7 +533,7 @@
                 <w:sz w:val="18"/>
                 <w:szCs w:val="18"/>
               </w:rPr>
-              <w:t xml:space="preserve">Confirmar precios y bonos de Halloween y Black Friday (propuesta en la pestaña Resumen) y crear los cupones SUSTO y BLACK con un solo enlace de pago por producto.</w:t>
+              <w:t xml:space="preserve">Decidir precios, bonos y cómo se nombra cada oferta de Halloween y Black Friday (propuesta en la pestaña Resumen). La promo va SOLO por WhatsApp: no se cambia la página vieja. Crear los cupones, las 3 mini landings (SUSTO; BLACK · Acero; BLACK · cursos) y el enlace de WhatsApp con cada palabra ya escrita, y ponerlo donde las piezas dicen [enlace de WhatsApp…].</w:t>
             </w:r>
           </w:p>
         </w:tc>
@@ -591,7 +591,7 @@
                 <w:sz w:val="18"/>
                 <w:szCs w:val="18"/>
               </w:rPr>
-              <w:t xml:space="preserve">Respuestas por DM de las palabras de historias (SUSTO, NIVEL, ACERO, ZAPATA, NAVES, LISTA, BLACK): las contesta una persona con el enlace o el precio. Dejar plantillas listas en la bandeja.</w:t>
+              <w:t xml:space="preserve">Respuestas a las palabras de historias, correos y comunidades (SUSTO, LISTA, BLACK, NAVES, NIVEL, ACERO, ZAPATA): las contesta una persona; las de oferta pasan a WhatsApp, donde va el precio y la mini landing. Dejar plantillas listas en la bandeja.</w:t>
             </w:r>
           </w:p>
         </w:tc>
@@ -619,7 +619,181 @@
                 <w:sz w:val="18"/>
                 <w:szCs w:val="18"/>
               </w:rPr>
-              <w:t xml:space="preserve">antes del 31-oct</w:t>
+              <w:t xml:space="preserve">antes del 30-oct</w:t>
+            </w:r>
+          </w:p>
+        </w:tc>
+      </w:tr>
+      <w:tr>
+        <w:tc>
+          <w:tcPr>
+            <w:tcW w:type="dxa" w:w="500"/>
+          </w:tcPr>
+          <w:p>
+            <w:r>
+              <w:rPr>
+                <w:sz w:val="18"/>
+                <w:szCs w:val="18"/>
+              </w:rPr>
+              <w:t xml:space="preserve">☐</w:t>
+            </w:r>
+          </w:p>
+        </w:tc>
+        <w:tc>
+          <w:tcPr>
+            <w:tcW w:type="dxa" w:w="4600"/>
+          </w:tcPr>
+          <w:p>
+            <w:r>
+              <w:rPr>
+                <w:sz w:val="18"/>
+                <w:szCs w:val="18"/>
+              </w:rPr>
+              <w:t xml:space="preserve">Publicar los 2 reels de prueba ya editados («6 uniones acero-hormigón» y «¿La IA te va a reemplazar?») antes del 31-oct, y anotar su enlace para la revisión de formatos.</w:t>
+            </w:r>
+          </w:p>
+        </w:tc>
+        <w:tc>
+          <w:tcPr>
+            <w:tcW w:type="dxa" w:w="3800"/>
+          </w:tcPr>
+          <w:p>
+            <w:r>
+              <w:rPr>
+                <w:sz w:val="18"/>
+                <w:szCs w:val="18"/>
+              </w:rPr>
+              <w:t xml:space="preserve">La revisión de formatos del 9-nov</w:t>
+            </w:r>
+          </w:p>
+        </w:tc>
+        <w:tc>
+          <w:tcPr>
+            <w:tcW w:type="dxa" w:w="2200"/>
+          </w:tcPr>
+          <w:p>
+            <w:r>
+              <w:rPr>
+                <w:sz w:val="18"/>
+                <w:szCs w:val="18"/>
+              </w:rPr>
+              <w:t xml:space="preserve">antes del sáb 31-oct</w:t>
+            </w:r>
+          </w:p>
+        </w:tc>
+      </w:tr>
+      <w:tr>
+        <w:tc>
+          <w:tcPr>
+            <w:tcW w:type="dxa" w:w="500"/>
+          </w:tcPr>
+          <w:p>
+            <w:r>
+              <w:rPr>
+                <w:sz w:val="18"/>
+                <w:szCs w:val="18"/>
+              </w:rPr>
+              <w:t xml:space="preserve">☐</w:t>
+            </w:r>
+          </w:p>
+        </w:tc>
+        <w:tc>
+          <w:tcPr>
+            <w:tcW w:type="dxa" w:w="4600"/>
+          </w:tcPr>
+          <w:p>
+            <w:r>
+              <w:rPr>
+                <w:sz w:val="18"/>
+                <w:szCs w:val="18"/>
+              </w:rPr>
+              <w:t xml:space="preserve">Producir la chuleta 2 (cerchas) en estilo 9, pizarra con voz, y «no compres por el descuento» en estilo 10, motion cromado. Son las piezas de prueba de formato del mes.</w:t>
+            </w:r>
+          </w:p>
+        </w:tc>
+        <w:tc>
+          <w:tcPr>
+            <w:tcW w:type="dxa" w:w="3800"/>
+          </w:tcPr>
+          <w:p>
+            <w:r>
+              <w:rPr>
+                <w:sz w:val="18"/>
+                <w:szCs w:val="18"/>
+              </w:rPr>
+              <w:t xml:space="preserve">Comparar formatos con el mismo tipo de tema</w:t>
+            </w:r>
+          </w:p>
+        </w:tc>
+        <w:tc>
+          <w:tcPr>
+            <w:tcW w:type="dxa" w:w="2200"/>
+          </w:tcPr>
+          <w:p>
+            <w:r>
+              <w:rPr>
+                <w:sz w:val="18"/>
+                <w:szCs w:val="18"/>
+              </w:rPr>
+              <w:t xml:space="preserve">2 días antes de cada fecha</w:t>
+            </w:r>
+          </w:p>
+        </w:tc>
+      </w:tr>
+      <w:tr>
+        <w:tc>
+          <w:tcPr>
+            <w:tcW w:type="dxa" w:w="500"/>
+          </w:tcPr>
+          <w:p>
+            <w:r>
+              <w:rPr>
+                <w:sz w:val="18"/>
+                <w:szCs w:val="18"/>
+              </w:rPr>
+              <w:t xml:space="preserve">☐</w:t>
+            </w:r>
+          </w:p>
+        </w:tc>
+        <w:tc>
+          <w:tcPr>
+            <w:tcW w:type="dxa" w:w="4600"/>
+          </w:tcPr>
+          <w:p>
+            <w:r>
+              <w:rPr>
+                <w:sz w:val="18"/>
+                <w:szCs w:val="18"/>
+              </w:rPr>
+              <w:t xml:space="preserve">Revisión de formatos en prueba: correr scripts/formatos_prueba.py --mes 2026-11 y anotar en el calendario, por pieza, cuántos llegaron al WhatsApp y cuántas ventas salieron en 14 días (GHL).</w:t>
+            </w:r>
+          </w:p>
+        </w:tc>
+        <w:tc>
+          <w:tcPr>
+            <w:tcW w:type="dxa" w:w="3800"/>
+          </w:tcPr>
+          <w:p>
+            <w:r>
+              <w:rPr>
+                <w:sz w:val="18"/>
+                <w:szCs w:val="18"/>
+              </w:rPr>
+              <w:t xml:space="preserve">Qué formato entra fijo en diciembre</w:t>
+            </w:r>
+          </w:p>
+        </w:tc>
+        <w:tc>
+          <w:tcPr>
+            <w:tcW w:type="dxa" w:w="2200"/>
+          </w:tcPr>
+          <w:p>
+            <w:r>
+              <w:rPr>
+                <w:sz w:val="18"/>
+                <w:szCs w:val="18"/>
+              </w:rPr>
+              <w:t xml:space="preserve">lun 9-nov y lun 30-nov</w:t>
             </w:r>
           </w:p>
         </w:tc>
@@ -1137,7 +1311,7 @@
           <w:sz w:val="21"/>
           <w:szCs w:val="21"/>
         </w:rPr>
-        <w:t xml:space="preserve">EL MÁSTER NUNCA LLEVA PRECIO. Los precios de Acero, cursos y Black Friday van solo en pauta, correo y DM. Toda oferta cierra a la hora dicha (Ecuador) y NO se reabre.</w:t>
+        <w:t xml:space="preserve">LA PROMO SOLO POR WHATSAPP (Dayana, 23-oct): ninguna pieza pública lleva el precio de la oferta ni enlaza la página vieja. Quien responde o escribe al WhatsApp recibe el precio y la mini landing de su oferta. Ester decide los precios y cómo se nombran. El Máster nunca lleva precio. Toda oferta cierra a la hora dicha (Ecuador) y NO se reabre.</w:t>
       </w:r>
     </w:p>
     <w:p>
@@ -1154,7 +1328,7 @@
           <w:sz w:val="21"/>
           <w:szCs w:val="21"/>
         </w:rPr>
-        <w:t xml:space="preserve">Visuales = capturas reales de Revit/Robot/Navisworks y cámara de Gabriel. Nada técnico se publica sin que Gabriel lo revise (regla 0).</w:t>
+        <w:t xml:space="preserve">FORMATOS EN PRUEBA: chuleta visual sin voz, pizarra con voz de Gabriel (estilo 9) y Gabriel con motion cromado (estilo 10). Se revisan el 9 y el 30-nov. Un formato entra fijo solo si genera interés, interacción y ventas (pestaña Resumen).</w:t>
       </w:r>
     </w:p>
     <w:p>
@@ -1171,6 +1345,23 @@
           <w:sz w:val="21"/>
           <w:szCs w:val="21"/>
         </w:rPr>
+        <w:t xml:space="preserve">Visuales = capturas reales de Revit/Robot/Navisworks y cámara de Gabriel. Nada técnico se publica sin que Gabriel lo revise (regla 0).</w:t>
+      </w:r>
+    </w:p>
+    <w:p>
+      <w:pPr>
+        <w:pStyle w:val="ListParagraph"/>
+        <w:numPr>
+          <w:ilvl w:val="0"/>
+          <w:numId w:val="1"/>
+        </w:numPr>
+        <w:spacing w:after="50"/>
+      </w:pPr>
+      <w:r>
+        <w:rPr>
+          <w:sz w:val="21"/>
+          <w:szCs w:val="21"/>
+        </w:rPr>
         <w:t xml:space="preserve">Mínimo 60 % en el NÚCLEO. Cero OBRA. Ninguna pieza repite un id o un gancho ya usado.</w:t>
       </w:r>
     </w:p>
@@ -1193,6 +1384,664 @@
         <w:t xml:space="preserve">Regla de oro: al menos el 60% del contenido debe ser NUCLEO (BIM · IA · modelado · acero), no obra.</w:t>
       </w:r>
     </w:p>
+    <w:p>
+      <w:pPr>
+        <w:spacing w:after="100" w:before="280"/>
+      </w:pPr>
+      <w:r>
+        <w:rPr>
+          <w:b/>
+          <w:bCs/>
+          <w:color w:val="C96A1C"/>
+          <w:sz w:val="26"/>
+          <w:szCs w:val="26"/>
+        </w:rPr>
+        <w:t xml:space="preserve">Cómo se habla de la oferta este mes</w:t>
+      </w:r>
+    </w:p>
+    <w:p>
+      <w:pPr>
+        <w:spacing w:after="80"/>
+        <w:rPr>
+          <w:i/>
+          <w:iCs/>
+          <w:color w:val="5A6B7B"/>
+        </w:rPr>
+      </w:pPr>
+      <w:r>
+        <w:rPr>
+          <w:i/>
+          <w:iCs/>
+          <w:color w:val="5A6B7B"/>
+          <w:sz w:val="21"/>
+          <w:szCs w:val="21"/>
+        </w:rPr>
+        <w:t xml:space="preserve">Actualizado el 23-oct (Dayana): las decisiones de precio y de cómo se nombra cada oferta las toma ESTER. Los números de abajo son solo la propuesta de partida. La promo la recibe únicamente quien responde o escribe al WhatsApp: la página vieja no se toca (dejará de servir cuando salga la nueva) y cada oferta tiene su mini landing, que se manda solo por WhatsApp. Principios que siguen: escasez real (fecha y hora de cierre, no se reabre), bonos antes que descuentos grandes en lo caro, el Máster nunca con precio.</w:t>
+      </w:r>
+    </w:p>
+    <w:p>
+      <w:pPr>
+        <w:pStyle w:val="ListParagraph"/>
+        <w:numPr>
+          <w:ilvl w:val="0"/>
+          <w:numId w:val="1"/>
+        </w:numPr>
+        <w:spacing w:after="50"/>
+      </w:pPr>
+      <w:r>
+        <w:rPr>
+          <w:sz w:val="21"/>
+          <w:szCs w:val="21"/>
+        </w:rPr>
+        <w:t xml:space="preserve">Ninguna pieza pública (feed, historias, comunidades, LinkedIn, blog, anuncios ni correos) lleva el precio de la oferta ni enlaza la página vieja de pago.</w:t>
+      </w:r>
+    </w:p>
+    <w:p>
+      <w:pPr>
+        <w:pStyle w:val="ListParagraph"/>
+        <w:numPr>
+          <w:ilvl w:val="0"/>
+          <w:numId w:val="1"/>
+        </w:numPr>
+        <w:spacing w:after="50"/>
+      </w:pPr>
+      <w:r>
+        <w:rPr>
+          <w:sz w:val="21"/>
+          <w:szCs w:val="21"/>
+        </w:rPr>
+        <w:t xml:space="preserve">Las piezas dicen que HAY oferta, hasta cuándo y cómo pedirla: responder la historia, escribir la palabra por WhatsApp (SUSTO, LISTA, BLACK) o responder el correo.</w:t>
+      </w:r>
+    </w:p>
+    <w:p>
+      <w:pPr>
+        <w:pStyle w:val="ListParagraph"/>
+        <w:numPr>
+          <w:ilvl w:val="0"/>
+          <w:numId w:val="1"/>
+        </w:numPr>
+        <w:spacing w:after="50"/>
+      </w:pPr>
+      <w:r>
+        <w:rPr>
+          <w:sz w:val="21"/>
+          <w:szCs w:val="21"/>
+        </w:rPr>
+        <w:t xml:space="preserve">Por WhatsApp una persona manda el precio y la mini landing de esa oferta. Una mini landing por oferta (SUSTO · cursos; BLACK · Acero; BLACK · cursos); no se publica ni se enlaza en abierto.</w:t>
+      </w:r>
+    </w:p>
+    <w:p>
+      <w:pPr>
+        <w:pStyle w:val="ListParagraph"/>
+        <w:numPr>
+          <w:ilvl w:val="0"/>
+          <w:numId w:val="1"/>
+        </w:numPr>
+        <w:spacing w:after="50"/>
+      </w:pPr>
+      <w:r>
+        <w:rPr>
+          <w:sz w:val="21"/>
+          <w:szCs w:val="21"/>
+        </w:rPr>
+        <w:t xml:space="preserve">Los anuncios de Halloween y Black Friday llevan el botón «Enviar mensaje» y van a WhatsApp, no a la página.</w:t>
+      </w:r>
+    </w:p>
+    <w:p>
+      <w:pPr>
+        <w:pStyle w:val="ListParagraph"/>
+        <w:numPr>
+          <w:ilvl w:val="0"/>
+          <w:numId w:val="1"/>
+        </w:numPr>
+        <w:spacing w:after="50"/>
+      </w:pPr>
+      <w:r>
+        <w:rPr>
+          <w:sz w:val="21"/>
+          <w:szCs w:val="21"/>
+        </w:rPr>
+        <w:t xml:space="preserve">El Máster no lleva precio en ningún lado: en la Black Week va con bono y se habla en llamada.</w:t>
+      </w:r>
+    </w:p>
+    <w:p>
+      <w:pPr>
+        <w:pStyle w:val="ListParagraph"/>
+        <w:numPr>
+          <w:ilvl w:val="0"/>
+          <w:numId w:val="1"/>
+        </w:numPr>
+        <w:spacing w:after="50"/>
+      </w:pPr>
+      <w:r>
+        <w:rPr>
+          <w:sz w:val="21"/>
+          <w:szCs w:val="21"/>
+        </w:rPr>
+        <w:t xml:space="preserve">Ester decide: el precio final, si el descuento se dice en % o en $, si la mini landing muestra el precio normal tachado, los bonos y si entran los Diplomados.</w:t>
+      </w:r>
+    </w:p>
+    <w:p>
+      <w:pPr>
+        <w:spacing w:after="100" w:before="280"/>
+      </w:pPr>
+      <w:r>
+        <w:rPr>
+          <w:b/>
+          <w:bCs/>
+          <w:color w:val="C96A1C"/>
+          <w:sz w:val="26"/>
+          <w:szCs w:val="26"/>
+        </w:rPr>
+        <w:t xml:space="preserve">Formatos en prueba (se revisan cada mes)</w:t>
+      </w:r>
+    </w:p>
+    <w:p>
+      <w:pPr>
+        <w:spacing w:after="80"/>
+        <w:rPr>
+          <w:i/>
+          <w:iCs/>
+          <w:color w:val="5A6B7B"/>
+        </w:rPr>
+      </w:pPr>
+      <w:r>
+        <w:rPr>
+          <w:i/>
+          <w:iCs/>
+          <w:color w:val="5A6B7B"/>
+          <w:sz w:val="21"/>
+          <w:szCs w:val="21"/>
+        </w:rPr>
+        <w:t xml:space="preserve">Pedido de Dayana (23-oct): los formatos nuevos se prueban y se revisan cada mes. Un formato entra fijo a la matriz solo si genera las tres cosas: interés, interacción y ventas. Que tenga vistas no basta. Lo calcula scripts/formatos_prueba.py --mes 2026-11 contra la mediana de reels de los 90 días anteriores.</w:t>
+      </w:r>
+    </w:p>
+    <w:tbl>
+      <w:tblPr>
+        <w:tblW w:type="dxa" w:w="10600"/>
+        <w:tblBorders>
+          <w:top w:val="single" w:color="auto" w:sz="4"/>
+          <w:left w:val="single" w:color="auto" w:sz="4"/>
+          <w:bottom w:val="single" w:color="auto" w:sz="4"/>
+          <w:right w:val="single" w:color="auto" w:sz="4"/>
+          <w:insideH w:val="single" w:color="auto" w:sz="4"/>
+          <w:insideV w:val="single" w:color="auto" w:sz="4"/>
+        </w:tblBorders>
+      </w:tblPr>
+      <w:tblGrid>
+        <w:gridCol w:w="1800"/>
+        <w:gridCol w:w="5200"/>
+        <w:gridCol w:w="3600"/>
+      </w:tblGrid>
+      <w:tr>
+        <w:trPr>
+          <w:tblHeader/>
+        </w:trPr>
+        <w:tc>
+          <w:tcPr>
+            <w:tcW w:type="dxa" w:w="1800"/>
+            <w:shd w:fill="0E2438" w:val="clear"/>
+          </w:tcPr>
+          <w:p>
+            <w:r>
+              <w:rPr>
+                <w:b/>
+                <w:bCs/>
+                <w:color w:val="FFFFFF"/>
+                <w:sz w:val="18"/>
+                <w:szCs w:val="18"/>
+              </w:rPr>
+              <w:t xml:space="preserve">Qué se mide</w:t>
+            </w:r>
+          </w:p>
+        </w:tc>
+        <w:tc>
+          <w:tcPr>
+            <w:tcW w:type="dxa" w:w="5200"/>
+            <w:shd w:fill="0E2438" w:val="clear"/>
+          </w:tcPr>
+          <w:p>
+            <w:r>
+              <w:rPr>
+                <w:b/>
+                <w:bCs/>
+                <w:color w:val="FFFFFF"/>
+                <w:sz w:val="18"/>
+                <w:szCs w:val="18"/>
+              </w:rPr>
+              <w:t xml:space="preserve">Umbral</w:t>
+            </w:r>
+          </w:p>
+        </w:tc>
+        <w:tc>
+          <w:tcPr>
+            <w:tcW w:type="dxa" w:w="3600"/>
+            <w:shd w:fill="0E2438" w:val="clear"/>
+          </w:tcPr>
+          <w:p>
+            <w:r>
+              <w:rPr>
+                <w:b/>
+                <w:bCs/>
+                <w:color w:val="FFFFFF"/>
+                <w:sz w:val="18"/>
+                <w:szCs w:val="18"/>
+              </w:rPr>
+              <w:t xml:space="preserve">De dónde sale</w:t>
+            </w:r>
+          </w:p>
+        </w:tc>
+      </w:tr>
+      <w:tr>
+        <w:tc>
+          <w:tcPr>
+            <w:tcW w:type="dxa" w:w="1800"/>
+          </w:tcPr>
+          <w:p>
+            <w:r>
+              <w:rPr>
+                <w:sz w:val="18"/>
+                <w:szCs w:val="18"/>
+              </w:rPr>
+              <w:t xml:space="preserve">Interés</w:t>
+            </w:r>
+          </w:p>
+        </w:tc>
+        <w:tc>
+          <w:tcPr>
+            <w:tcW w:type="dxa" w:w="5200"/>
+          </w:tcPr>
+          <w:p>
+            <w:r>
+              <w:rPr>
+                <w:sz w:val="18"/>
+                <w:szCs w:val="18"/>
+              </w:rPr>
+              <w:t xml:space="preserve">Vistas a los 7 días ≥ 1,5 veces la mediana de reels de 90 días</w:t>
+            </w:r>
+          </w:p>
+        </w:tc>
+        <w:tc>
+          <w:tcPr>
+            <w:tcW w:type="dxa" w:w="3600"/>
+          </w:tcPr>
+          <w:p>
+            <w:r>
+              <w:rPr>
+                <w:sz w:val="18"/>
+                <w:szCs w:val="18"/>
+              </w:rPr>
+              <w:t xml:space="preserve">matriz.json (Graph API, lunes y viernes)</w:t>
+            </w:r>
+          </w:p>
+        </w:tc>
+      </w:tr>
+      <w:tr>
+        <w:tc>
+          <w:tcPr>
+            <w:tcW w:type="dxa" w:w="1800"/>
+          </w:tcPr>
+          <w:p>
+            <w:r>
+              <w:rPr>
+                <w:sz w:val="18"/>
+                <w:szCs w:val="18"/>
+              </w:rPr>
+              <w:t xml:space="preserve">Interacción</w:t>
+            </w:r>
+          </w:p>
+        </w:tc>
+        <w:tc>
+          <w:tcPr>
+            <w:tcW w:type="dxa" w:w="5200"/>
+          </w:tcPr>
+          <w:p>
+            <w:r>
+              <w:rPr>
+                <w:sz w:val="18"/>
+                <w:szCs w:val="18"/>
+              </w:rPr>
+              <w:t xml:space="preserve">(comentarios + guardados + compartidos) por 1.000 vistas ≥ 2 veces la mediana, y comentarios por 1.000 ≥ la mediana</w:t>
+            </w:r>
+          </w:p>
+        </w:tc>
+        <w:tc>
+          <w:tcPr>
+            <w:tcW w:type="dxa" w:w="3600"/>
+          </w:tcPr>
+          <w:p>
+            <w:r>
+              <w:rPr>
+                <w:sz w:val="18"/>
+                <w:szCs w:val="18"/>
+              </w:rPr>
+              <w:t xml:space="preserve">matriz.json</w:t>
+            </w:r>
+          </w:p>
+        </w:tc>
+      </w:tr>
+      <w:tr>
+        <w:tc>
+          <w:tcPr>
+            <w:tcW w:type="dxa" w:w="1800"/>
+          </w:tcPr>
+          <w:p>
+            <w:r>
+              <w:rPr>
+                <w:sz w:val="18"/>
+                <w:szCs w:val="18"/>
+              </w:rPr>
+              <w:t xml:space="preserve">Venta</w:t>
+            </w:r>
+          </w:p>
+        </w:tc>
+        <w:tc>
+          <w:tcPr>
+            <w:tcW w:type="dxa" w:w="5200"/>
+          </w:tcPr>
+          <w:p>
+            <w:r>
+              <w:rPr>
+                <w:sz w:val="18"/>
+                <w:szCs w:val="18"/>
+              </w:rPr>
+              <w:t xml:space="preserve">≥ 10 personas escriben la palabra o llegan al WhatsApp en 14 días, y al menos 1 venta atribuida a la pieza</w:t>
+            </w:r>
+          </w:p>
+        </w:tc>
+        <w:tc>
+          <w:tcPr>
+            <w:tcW w:type="dxa" w:w="3600"/>
+          </w:tcPr>
+          <w:p>
+            <w:r>
+              <w:rPr>
+                <w:sz w:val="18"/>
+                <w:szCs w:val="18"/>
+              </w:rPr>
+              <w:t xml:space="preserve">GHL (etiqueta origen-bot-&lt;palabra&gt;) + Ester marca la fuente de la venta</w:t>
+            </w:r>
+          </w:p>
+        </w:tc>
+      </w:tr>
+    </w:tbl>
+    <w:p>
+      <w:pPr>
+        <w:pStyle w:val="ListParagraph"/>
+        <w:numPr>
+          <w:ilvl w:val="0"/>
+          <w:numId w:val="1"/>
+        </w:numPr>
+        <w:spacing w:after="50"/>
+      </w:pPr>
+      <w:r>
+        <w:rPr>
+          <w:sz w:val="21"/>
+          <w:szCs w:val="21"/>
+        </w:rPr>
+        <w:t xml:space="preserve">3 de 3 en al menos 2 piezas → entra FIJO a la matriz (mínimo 1 por semana).</w:t>
+      </w:r>
+    </w:p>
+    <w:p>
+      <w:pPr>
+        <w:pStyle w:val="ListParagraph"/>
+        <w:numPr>
+          <w:ilvl w:val="0"/>
+          <w:numId w:val="1"/>
+        </w:numPr>
+        <w:spacing w:after="50"/>
+      </w:pPr>
+      <w:r>
+        <w:rPr>
+          <w:sz w:val="21"/>
+          <w:szCs w:val="21"/>
+        </w:rPr>
+        <w:t xml:space="preserve">2 de 3 → se repite una vez más el mes siguiente con otro tema; si vuelve a quedarse en 2, entra solo como formato de alcance (sin cuota fija).</w:t>
+      </w:r>
+    </w:p>
+    <w:p>
+      <w:pPr>
+        <w:pStyle w:val="ListParagraph"/>
+        <w:numPr>
+          <w:ilvl w:val="0"/>
+          <w:numId w:val="1"/>
+        </w:numPr>
+        <w:spacing w:after="50"/>
+      </w:pPr>
+      <w:r>
+        <w:rPr>
+          <w:sz w:val="21"/>
+          <w:szCs w:val="21"/>
+        </w:rPr>
+        <w:t xml:space="preserve">0 o 1 de 3 en 2 piezas → sale de la matriz.</w:t>
+      </w:r>
+    </w:p>
+    <w:p>
+      <w:pPr>
+        <w:pStyle w:val="ListParagraph"/>
+        <w:numPr>
+          <w:ilvl w:val="0"/>
+          <w:numId w:val="1"/>
+        </w:numPr>
+        <w:spacing w:after="50"/>
+      </w:pPr>
+      <w:r>
+        <w:rPr>
+          <w:sz w:val="21"/>
+          <w:szCs w:val="21"/>
+        </w:rPr>
+        <w:t xml:space="preserve">Nunca se decide con una sola pieza ni con piezas de menos de 7 días.</w:t>
+      </w:r>
+    </w:p>
+    <w:tbl>
+      <w:tblPr>
+        <w:tblW w:type="dxa" w:w="10600"/>
+        <w:tblBorders>
+          <w:top w:val="single" w:color="auto" w:sz="4"/>
+          <w:left w:val="single" w:color="auto" w:sz="4"/>
+          <w:bottom w:val="single" w:color="auto" w:sz="4"/>
+          <w:right w:val="single" w:color="auto" w:sz="4"/>
+          <w:insideH w:val="single" w:color="auto" w:sz="4"/>
+          <w:insideV w:val="single" w:color="auto" w:sz="4"/>
+        </w:tblBorders>
+      </w:tblPr>
+      <w:tblGrid>
+        <w:gridCol w:w="3000"/>
+        <w:gridCol w:w="3000"/>
+        <w:gridCol w:w="4600"/>
+      </w:tblGrid>
+      <w:tr>
+        <w:trPr>
+          <w:tblHeader/>
+        </w:trPr>
+        <w:tc>
+          <w:tcPr>
+            <w:tcW w:type="dxa" w:w="3000"/>
+            <w:shd w:fill="0E2438" w:val="clear"/>
+          </w:tcPr>
+          <w:p>
+            <w:r>
+              <w:rPr>
+                <w:b/>
+                <w:bCs/>
+                <w:color w:val="FFFFFF"/>
+                <w:sz w:val="18"/>
+                <w:szCs w:val="18"/>
+              </w:rPr>
+              <w:t xml:space="preserve">Formato</w:t>
+            </w:r>
+          </w:p>
+        </w:tc>
+        <w:tc>
+          <w:tcPr>
+            <w:tcW w:type="dxa" w:w="3000"/>
+            <w:shd w:fill="0E2438" w:val="clear"/>
+          </w:tcPr>
+          <w:p>
+            <w:r>
+              <w:rPr>
+                <w:b/>
+                <w:bCs/>
+                <w:color w:val="FFFFFF"/>
+                <w:sz w:val="18"/>
+                <w:szCs w:val="18"/>
+              </w:rPr>
+              <w:t xml:space="preserve">Estado</w:t>
+            </w:r>
+          </w:p>
+        </w:tc>
+        <w:tc>
+          <w:tcPr>
+            <w:tcW w:type="dxa" w:w="4600"/>
+            <w:shd w:fill="0E2438" w:val="clear"/>
+          </w:tcPr>
+          <w:p>
+            <w:r>
+              <w:rPr>
+                <w:b/>
+                <w:bCs/>
+                <w:color w:val="FFFFFF"/>
+                <w:sz w:val="18"/>
+                <w:szCs w:val="18"/>
+              </w:rPr>
+              <w:t xml:space="preserve">Piezas</w:t>
+            </w:r>
+          </w:p>
+        </w:tc>
+      </w:tr>
+      <w:tr>
+        <w:tc>
+          <w:tcPr>
+            <w:tcW w:type="dxa" w:w="3000"/>
+          </w:tcPr>
+          <w:p>
+            <w:r>
+              <w:rPr>
+                <w:sz w:val="18"/>
+                <w:szCs w:val="18"/>
+              </w:rPr>
+              <w:t xml:space="preserve">Chuleta visual sin voz (lista que se arma en pantalla)</w:t>
+            </w:r>
+          </w:p>
+        </w:tc>
+        <w:tc>
+          <w:tcPr>
+            <w:tcW w:type="dxa" w:w="3000"/>
+          </w:tcPr>
+          <w:p>
+            <w:r>
+              <w:rPr>
+                <w:sz w:val="18"/>
+                <w:szCs w:val="18"/>
+              </w:rPr>
+              <w:t xml:space="preserve">Probado en interés e interacción. Falta probar que vende.</w:t>
+            </w:r>
+          </w:p>
+        </w:tc>
+        <w:tc>
+          <w:tcPr>
+            <w:tcW w:type="dxa" w:w="4600"/>
+          </w:tcPr>
+          <w:p>
+            <w:r>
+              <w:rPr>
+                <w:sz w:val="18"/>
+                <w:szCs w:val="18"/>
+              </w:rPr>
+              <w:t xml:space="preserve">simbologia-niveles (fuera de matriz) (DeubXmFlIDE), oct-uniones-acero-hormigon-reel, nov-chuleta-1-perfiles-acero-reel, nov-chuleta-3-lod-reel, nov-chuleta-4-uniones-reel</w:t>
+            </w:r>
+          </w:p>
+        </w:tc>
+      </w:tr>
+      <w:tr>
+        <w:tc>
+          <w:tcPr>
+            <w:tcW w:type="dxa" w:w="3000"/>
+          </w:tcPr>
+          <w:p>
+            <w:r>
+              <w:rPr>
+                <w:sz w:val="18"/>
+                <w:szCs w:val="18"/>
+              </w:rPr>
+              <w:t xml:space="preserve">Pizarra dibujada con voz de Gabriel por IA (estilo 9)</w:t>
+            </w:r>
+          </w:p>
+        </w:tc>
+        <w:tc>
+          <w:tcPr>
+            <w:tcW w:type="dxa" w:w="3000"/>
+          </w:tcPr>
+          <w:p>
+            <w:r>
+              <w:rPr>
+                <w:sz w:val="18"/>
+                <w:szCs w:val="18"/>
+              </w:rPr>
+              <w:t xml:space="preserve">1 pieza buena (cimentaciones). Falta una segunda pieza y probar venta.</w:t>
+            </w:r>
+          </w:p>
+        </w:tc>
+        <w:tc>
+          <w:tcPr>
+            <w:tcW w:type="dxa" w:w="4600"/>
+          </w:tcPr>
+          <w:p>
+            <w:r>
+              <w:rPr>
+                <w:sz w:val="18"/>
+                <w:szCs w:val="18"/>
+              </w:rPr>
+              <w:t xml:space="preserve">cimentaciones (fuera de matriz) (Der2lsgjwu5), oct-ia-reemplazar-ingeniero-reel, nov-chuleta-2-cerchas-reel</w:t>
+            </w:r>
+          </w:p>
+        </w:tc>
+      </w:tr>
+      <w:tr>
+        <w:tc>
+          <w:tcPr>
+            <w:tcW w:type="dxa" w:w="3000"/>
+          </w:tcPr>
+          <w:p>
+            <w:r>
+              <w:rPr>
+                <w:sz w:val="18"/>
+                <w:szCs w:val="18"/>
+              </w:rPr>
+              <w:t xml:space="preserve">Gabriel + motion cromado (estilo 10)</w:t>
+            </w:r>
+          </w:p>
+        </w:tc>
+        <w:tc>
+          <w:tcPr>
+            <w:tcW w:type="dxa" w:w="3000"/>
+          </w:tcPr>
+          <w:p>
+            <w:r>
+              <w:rPr>
+                <w:sz w:val="18"/>
+                <w:szCs w:val="18"/>
+              </w:rPr>
+              <w:t xml:space="preserve">Nuevo: todavía sin pieza publicada.</w:t>
+            </w:r>
+          </w:p>
+        </w:tc>
+        <w:tc>
+          <w:tcPr>
+            <w:tcW w:type="dxa" w:w="4600"/>
+          </w:tcPr>
+          <w:p>
+            <w:r>
+              <w:rPr>
+                <w:sz w:val="18"/>
+                <w:szCs w:val="18"/>
+              </w:rPr>
+              <w:t xml:space="preserve">nov-gabriel-no-compres-descuento-reel · control: nov-gabriel-error-modelos-reel (Gabriel a cámara sin motion, 14-nov)</w:t>
+            </w:r>
+          </w:p>
+        </w:tc>
+      </w:tr>
+    </w:tbl>
     <w:p>
       <w:pPr>
         <w:pStyle w:val="Heading1"/>
@@ -4609,7 +5458,7 @@
           <w:sz w:val="18"/>
           <w:szCs w:val="18"/>
         </w:rPr>
-        <w:t xml:space="preserve">Diseña y calcula naves de acero en software. Precio de Black Friday hasta el lunes 30.</w:t>
+        <w:t xml:space="preserve">Diseña y calcula naves de acero en software. Oferta de Black Friday hasta el lunes 30, solo por</w:t>
       </w:r>
     </w:p>
     <w:p>
@@ -4626,6 +5475,23 @@
           <w:sz w:val="18"/>
           <w:szCs w:val="18"/>
         </w:rPr>
+        <w:t xml:space="preserve">WhatsApp.</w:t>
+      </w:r>
+    </w:p>
+    <w:p>
+      <w:pPr>
+        <w:pBdr>
+          <w:left w:val="single" w:color="B9C6D3" w:sz="14" w:space="8"/>
+        </w:pBdr>
+        <w:shd w:fill="F7F9FB" w:val="clear"/>
+        <w:spacing w:after="0"/>
+      </w:pPr>
+      <w:r>
+        <w:rPr>
+          <w:rFonts w:ascii="Consolas" w:cs="Consolas" w:eastAsia="Consolas" w:hAnsi="Consolas"/>
+          <w:sz w:val="18"/>
+          <w:szCs w:val="18"/>
+        </w:rPr>
         <w:t xml:space="preserve"> </w:t>
       </w:r>
     </w:p>
@@ -4643,7 +5509,7 @@
           <w:sz w:val="18"/>
           <w:szCs w:val="18"/>
         </w:rPr>
-        <w:t xml:space="preserve">Especialización en Diseño Estructural BIM en Acero con Tutor IA: [PRECIO BF] en lugar de $225.</w:t>
+        <w:t xml:space="preserve">Especialización en Diseño Estructural BIM en Acero con Tutor IA: Revit, Robot y Advance Steel,</w:t>
       </w:r>
     </w:p>
     <w:p>
@@ -4660,7 +5526,7 @@
           <w:sz w:val="18"/>
           <w:szCs w:val="18"/>
         </w:rPr>
-        <w:t xml:space="preserve">Revit, Robot y Advance Steel, de principio a fin.</w:t>
+        <w:t xml:space="preserve">de principio a fin. Escríbenos y te mandamos el precio.</w:t>
       </w:r>
     </w:p>
     <w:p>
@@ -4952,7 +5818,7 @@
                 <w:sz w:val="18"/>
                 <w:szCs w:val="18"/>
               </w:rPr>
-              <w:t xml:space="preserve">Ventas atribuidas (WhatsApp y formulario) por día; CPL</w:t>
+              <w:t xml:space="preserve">Conversaciones de WhatsApp iniciadas, costo por conversación y ventas que salen de ellas (GHL)</w:t>
             </w:r>
           </w:p>
         </w:tc>
@@ -4975,7 +5841,7 @@
           <w:sz w:val="21"/>
           <w:szCs w:val="21"/>
         </w:rPr>
-        <w:t xml:space="preserve">⚠ El precio de Black Friday lo confirma Dayana (propuesta $179). Un solo enlace de pago.</w:t>
+        <w:t xml:space="preserve">⚠ Destino: WhatsApp (botón «Enviar mensaje»), nunca la página vieja. Por WhatsApp se manda el precio y la mini landing BLACK · Acero. REGLA DE NOVIEMBRE: el precio de la oferta NO va en público ni se enlaza la página vieja. Quien responde o escribe al WhatsApp recibe el precio y la mini landing de la oferta. Precio y forma de nombrarlo: los decide Ester.</w:t>
       </w:r>
     </w:p>
     <w:p>
@@ -5118,7 +5984,7 @@
           <w:sz w:val="18"/>
           <w:szCs w:val="18"/>
         </w:rPr>
-        <w:t xml:space="preserve">Naves Industriales PRO con precio especial por tiempo limitado: el cupón vence a la hora</w:t>
+        <w:t xml:space="preserve">Naves Industriales PRO con oferta por tiempo limitado, solo por WhatsApp: escríbenos y te</w:t>
       </w:r>
     </w:p>
     <w:p>
@@ -5135,7 +6001,7 @@
           <w:sz w:val="18"/>
           <w:szCs w:val="18"/>
         </w:rPr>
-        <w:t xml:space="preserve">indicada y no se renueva.</w:t>
+        <w:t xml:space="preserve">mandamos el precio y el enlace. Vence a la hora indicada y no se renueva.</w:t>
       </w:r>
     </w:p>
     <w:p>
@@ -5333,7 +6199,7 @@
                 <w:sz w:val="18"/>
                 <w:szCs w:val="18"/>
               </w:rPr>
-              <w:t xml:space="preserve">Comprar</w:t>
+              <w:t xml:space="preserve">Enviar mensaje</w:t>
             </w:r>
           </w:p>
         </w:tc>
@@ -5363,7 +6229,7 @@
                 <w:sz w:val="18"/>
                 <w:szCs w:val="18"/>
               </w:rPr>
-              <w:t xml:space="preserve">Interacción 90 días + visitantes de la landing de Naves PRO</w:t>
+              <w:t xml:space="preserve">Interacción 90 días + visitantes de la landing de Naves PRO (como público, no como destino)</w:t>
             </w:r>
           </w:p>
         </w:tc>
@@ -5393,7 +6259,7 @@
                 <w:sz w:val="18"/>
                 <w:szCs w:val="18"/>
               </w:rPr>
-              <w:t xml:space="preserve">Compras y costo por compra</w:t>
+              <w:t xml:space="preserve">Conversaciones de WhatsApp, compras y costo por compra</w:t>
             </w:r>
           </w:p>
         </w:tc>
@@ -5416,7 +6282,7 @@
           <w:sz w:val="21"/>
           <w:szCs w:val="21"/>
         </w:rPr>
-        <w:t xml:space="preserve">⚠ Dos ventanas: Halloween (30-oct al 1-nov) y Black Week. Precio en la landing.</w:t>
+        <w:t xml:space="preserve">⚠ Dos ventanas: Halloween (30-oct al 1-nov) y Black Week. Destino: WhatsApp, no la landing de Naves PRO. Por WhatsApp va la mini landing de la oferta. REGLA DE NOVIEMBRE: el precio de la oferta NO va en público ni se enlaza la página vieja. Quien responde o escribe al WhatsApp recibe el precio y la mini landing de la oferta. Precio y forma de nombrarlo: los decide Ester.</w:t>
       </w:r>
     </w:p>
     <w:p>
@@ -15945,7 +16811,7 @@
           <w:sz w:val="21"/>
           <w:szCs w:val="21"/>
         </w:rPr>
-        <w:t xml:space="preserve">SERIE «CHULETA DEL INGENIERO» (nace de los dos reels fuera de matriz de octubre: «Simbología de niveles en planos ¿Cuál usas más?», 20-oct, 57.230 vistas, 220 comentarios, 2.455 guardados y 705 compartidos, el más compartido de la cuenta; y «5 tipos de cimentación», 19-oct, 8.598 vistas, 7,33 comentarios por 1.000). Formato: reel de 15-25 s armado con láminas limpias (fondo blanco, trazo técnico, una opción por lámina, numeradas), música en tendencia, texto grande, SIN voz o con voz mínima. Termina con «¿Cuál usas tú?» para que comenten la opción. La palabra va en el caption y en la última lámina. Se arma en edición, no hace falta grabar a Gabriel. Efeméride: 10-nov, Día Mundial de la Ciencia (UNESCO): «la física detrás de una nave». Gabriel confirma en 2 minutos cómo trabaja cada diagonal (tracción/compresión) para la carga gravitatoria típica.</w:t>
+        <w:t xml:space="preserve">PRUEBA DE FORMATO (estilo 9 · pizarra dibujada con voz de Gabriel por IA, como «5 tipos de cimentación»). Las otras 3 chuletas van como «Simbología de niveles» (lista visual sin voz): así la serie compara los dos formatos con el mismo tipo de tema. Plantilla: video-recursos/plantillas/pizarra-dibujada. SERIE «CHULETA DEL INGENIERO» (nace de los dos reels fuera de matriz de octubre: «Simbología de niveles en planos ¿Cuál usas más?», 20-oct, 57.230 vistas, 220 comentarios, 2.455 guardados y 705 compartidos, el más compartido de la cuenta; y «5 tipos de cimentación», 19-oct, 8.598 vistas, 7,33 comentarios por 1.000). Formato: reel de 15-25 s armado con láminas limpias (fondo blanco, trazo técnico, una opción por lámina, numeradas), música en tendencia, texto grande, SIN voz o con voz mínima. Termina con «¿Cuál usas tú?» para que comenten la opción. La palabra va en el caption y en la última lámina. Se arma en edición, no hace falta grabar a Gabriel. Efeméride: 10-nov, Día Mundial de la Ciencia (UNESCO): «la física detrás de una nave». Gabriel confirma en 2 minutos cómo trabaja cada diagonal (tracción/compresión) para la carga gravitatoria típica.</w:t>
       </w:r>
     </w:p>
     <w:p>
@@ -27237,7 +28103,7 @@
           <w:sz w:val="21"/>
           <w:szCs w:val="21"/>
         </w:rPr>
-        <w:t xml:space="preserve">Gabriel a cámara (pedido de Dayana: más Gabriel). Objeción de dinero sin precio. La honestidad es el ángulo: en octubre la objeción de tiempo resolvió 3 de 5 casos (COMPRADORES-VS-NO.md).</w:t>
+        <w:t xml:space="preserve">PRUEBA DE FORMATO (estilo 10 · Gabriel + motion cromado). El control es «el error que más veo» (14-nov), Gabriel a cámara sin motion. Plantilla: video-recursos/plantillas/gabriel-motion-cromado. Gabriel a cámara (pedido de Dayana: más Gabriel). Objeción de dinero sin precio. La honestidad es el ángulo: en octubre la objeción de tiempo resolvió 3 de 5 casos (COMPRADORES-VS-NO.md).</w:t>
       </w:r>
     </w:p>
     <w:p>
@@ -28385,6 +29251,23 @@
     </w:p>
     <w:p>
       <w:pPr>
+        <w:pStyle w:val="ListParagraph"/>
+        <w:numPr>
+          <w:ilvl w:val="0"/>
+          <w:numId w:val="1"/>
+        </w:numPr>
+        <w:spacing w:after="50"/>
+      </w:pPr>
+      <w:r>
+        <w:rPr>
+          <w:sz w:val="21"/>
+          <w:szCs w:val="21"/>
+        </w:rPr>
+        <w:t xml:space="preserve">Si es oferta, el único enlace es el de WhatsApp con la palabra ya escrita. Nunca el precio ni la página vieja.</w:t>
+      </w:r>
+    </w:p>
+    <w:p>
+      <w:pPr>
         <w:spacing w:after="100" w:before="280"/>
       </w:pPr>
       <w:r>
@@ -30244,7 +31127,7 @@
           <w:sz w:val="18"/>
           <w:szCs w:val="18"/>
         </w:rPr>
-        <w:t xml:space="preserve">Para que no te pase, este fin de semana los cursos de bajo costo tienen precio de Halloween con</w:t>
+        <w:t xml:space="preserve">Para que no te pase, este fin de semana hay oferta de Halloween en los cursos de bajo costo,</w:t>
       </w:r>
     </w:p>
     <w:p>
@@ -30261,7 +31144,7 @@
           <w:sz w:val="18"/>
           <w:szCs w:val="18"/>
         </w:rPr>
-        <w:t xml:space="preserve">el cupón SUSTO, hasta el domingo 1 de noviembre a las 23:59 (hora de Ecuador). Después vuelven</w:t>
+        <w:t xml:space="preserve">como Naves Industriales PRO. No está en la web: es solo para quien nos escriba por WhatsApp,</w:t>
       </w:r>
     </w:p>
     <w:p>
@@ -30278,7 +31161,7 @@
           <w:sz w:val="18"/>
           <w:szCs w:val="18"/>
         </w:rPr>
-        <w:t xml:space="preserve">a su precio.</w:t>
+        <w:t xml:space="preserve">hasta el domingo 1 de noviembre a las 23:59 (hora de Ecuador).</w:t>
       </w:r>
     </w:p>
     <w:p>
@@ -30312,7 +31195,7 @@
           <w:sz w:val="18"/>
           <w:szCs w:val="18"/>
         </w:rPr>
-        <w:t xml:space="preserve">El más pedido es Naves Industriales PRO: una nave industrial completa, paso a paso.</w:t>
+        <w:t xml:space="preserve">Escríbenos SUSTO y te mandamos la oferta: [enlace de WhatsApp de la academia con «SUSTO» ya</w:t>
       </w:r>
     </w:p>
     <w:p>
@@ -30329,7 +31212,7 @@
           <w:sz w:val="18"/>
           <w:szCs w:val="18"/>
         </w:rPr>
-        <w:t xml:space="preserve">https://funnel.dgdesignmodeling.com/naves-industriales-pro-page-574823</w:t>
+        <w:t xml:space="preserve">escrito, lo pone Ester]</w:t>
       </w:r>
     </w:p>
     <w:p>
@@ -33845,7 +34728,7 @@
           <w:sz w:val="18"/>
           <w:szCs w:val="18"/>
         </w:rPr>
-        <w:t xml:space="preserve">Desde hoy y hasta el domingo 22 abrimos el acceso anticipado de Black Friday: la</w:t>
+        <w:t xml:space="preserve">Desde hoy y hasta el domingo 22 abrimos el acceso anticipado de Black Friday para la</w:t>
       </w:r>
     </w:p>
     <w:p>
@@ -33862,7 +34745,7 @@
           <w:sz w:val="18"/>
           <w:szCs w:val="18"/>
         </w:rPr>
-        <w:t xml:space="preserve">Especialización en Acero y los cursos de bajo costo con el precio de Black Friday, antes que</w:t>
+        <w:t xml:space="preserve">Especialización en Acero y los cursos de bajo costo, antes que nadie.</w:t>
       </w:r>
     </w:p>
     <w:p>
@@ -33879,7 +34762,7 @@
           <w:sz w:val="18"/>
           <w:szCs w:val="18"/>
         </w:rPr>
-        <w:t xml:space="preserve">nadie.</w:t>
+        <w:t xml:space="preserve"> </w:t>
       </w:r>
     </w:p>
     <w:p>
@@ -33896,7 +34779,7 @@
           <w:sz w:val="18"/>
           <w:szCs w:val="18"/>
         </w:rPr>
-        <w:t xml:space="preserve"> </w:t>
+        <w:t xml:space="preserve">La oferta no está en la web. Escríbenos LISTA por WhatsApp y una persona del equipo te manda el</w:t>
       </w:r>
     </w:p>
     <w:p>
@@ -33913,92 +34796,7 @@
           <w:sz w:val="18"/>
           <w:szCs w:val="18"/>
         </w:rPr>
-        <w:t xml:space="preserve">Temario de Acero:</w:t>
-      </w:r>
-    </w:p>
-    <w:p>
-      <w:pPr>
-        <w:pBdr>
-          <w:left w:val="single" w:color="B9C6D3" w:sz="14" w:space="8"/>
-        </w:pBdr>
-        <w:shd w:fill="F7F9FB" w:val="clear"/>
-        <w:spacing w:after="0"/>
-      </w:pPr>
-      <w:r>
-        <w:rPr>
-          <w:rFonts w:ascii="Consolas" w:cs="Consolas" w:eastAsia="Consolas" w:hAnsi="Consolas"/>
-          <w:sz w:val="18"/>
-          <w:szCs w:val="18"/>
-        </w:rPr>
-        <w:t xml:space="preserve">https://designmodelingacademy.com/es/especializacion/diseno-estructural-bim-acero</w:t>
-      </w:r>
-    </w:p>
-    <w:p>
-      <w:pPr>
-        <w:pBdr>
-          <w:left w:val="single" w:color="B9C6D3" w:sz="14" w:space="8"/>
-        </w:pBdr>
-        <w:shd w:fill="F7F9FB" w:val="clear"/>
-        <w:spacing w:after="0"/>
-      </w:pPr>
-      <w:r>
-        <w:rPr>
-          <w:rFonts w:ascii="Consolas" w:cs="Consolas" w:eastAsia="Consolas" w:hAnsi="Consolas"/>
-          <w:sz w:val="18"/>
-          <w:szCs w:val="18"/>
-        </w:rPr>
-        <w:t xml:space="preserve">Naves Industriales PRO: https://funnel.dgdesignmodeling.com/naves-industriales-pro-page-574823</w:t>
-      </w:r>
-    </w:p>
-    <w:p>
-      <w:pPr>
-        <w:pBdr>
-          <w:left w:val="single" w:color="B9C6D3" w:sz="14" w:space="8"/>
-        </w:pBdr>
-        <w:shd w:fill="F7F9FB" w:val="clear"/>
-        <w:spacing w:after="0"/>
-      </w:pPr>
-      <w:r>
-        <w:rPr>
-          <w:rFonts w:ascii="Consolas" w:cs="Consolas" w:eastAsia="Consolas" w:hAnsi="Consolas"/>
-          <w:sz w:val="18"/>
-          <w:szCs w:val="18"/>
-        </w:rPr>
-        <w:t xml:space="preserve"> </w:t>
-      </w:r>
-    </w:p>
-    <w:p>
-      <w:pPr>
-        <w:pBdr>
-          <w:left w:val="single" w:color="B9C6D3" w:sz="14" w:space="8"/>
-        </w:pBdr>
-        <w:shd w:fill="F7F9FB" w:val="clear"/>
-        <w:spacing w:after="0"/>
-      </w:pPr>
-      <w:r>
-        <w:rPr>
-          <w:rFonts w:ascii="Consolas" w:cs="Consolas" w:eastAsia="Consolas" w:hAnsi="Consolas"/>
-          <w:sz w:val="18"/>
-          <w:szCs w:val="18"/>
-        </w:rPr>
-        <w:t xml:space="preserve">Si quieres el precio y el enlace, escríbenos por WhatsApp al número de la academia y te</w:t>
-      </w:r>
-    </w:p>
-    <w:p>
-      <w:pPr>
-        <w:pBdr>
-          <w:left w:val="single" w:color="B9C6D3" w:sz="14" w:space="8"/>
-        </w:pBdr>
-        <w:shd w:fill="F7F9FB" w:val="clear"/>
-        <w:spacing w:after="0"/>
-      </w:pPr>
-      <w:r>
-        <w:rPr>
-          <w:rFonts w:ascii="Consolas" w:cs="Consolas" w:eastAsia="Consolas" w:hAnsi="Consolas"/>
-          <w:sz w:val="18"/>
-          <w:szCs w:val="18"/>
-        </w:rPr>
-        <w:t xml:space="preserve">contesta una persona del equipo.</w:t>
+        <w:t xml:space="preserve">precio y el enlace: [enlace de WhatsApp de la academia con «LISTA» ya escrito, lo pone Ester]</w:t>
       </w:r>
     </w:p>
     <w:p>
@@ -34449,7 +35247,7 @@
           <w:sz w:val="18"/>
           <w:szCs w:val="18"/>
         </w:rPr>
-        <w:t xml:space="preserve">Acero: https://designmodelingacademy.com/es/especializacion/diseno-estructural-bim-acero</w:t>
+        <w:t xml:space="preserve">La oferta no está en la web: escríbenos BLACK por WhatsApp y te la mandamos: [enlace de</w:t>
       </w:r>
     </w:p>
     <w:p>
@@ -34466,7 +35264,7 @@
           <w:sz w:val="18"/>
           <w:szCs w:val="18"/>
         </w:rPr>
-        <w:t xml:space="preserve">Cursos: https://funnel.dgdesignmodeling.com/naves-industriales-pro-page-574823</w:t>
+        <w:t xml:space="preserve">WhatsApp de la academia con «BLACK» ya escrito, lo pone Ester]</w:t>
       </w:r>
     </w:p>
     <w:p>
@@ -34885,7 +35683,7 @@
           <w:sz w:val="18"/>
           <w:szCs w:val="18"/>
         </w:rPr>
-        <w:t xml:space="preserve">Lo que incluye:</w:t>
+        <w:t xml:space="preserve">La oferta de Acero y de los cursos de bajo costo va solo por WhatsApp. Escríbenos BLACK:</w:t>
       </w:r>
     </w:p>
     <w:p>
@@ -34902,7 +35700,7 @@
           <w:sz w:val="18"/>
           <w:szCs w:val="18"/>
         </w:rPr>
-        <w:t xml:space="preserve">https://designmodelingacademy.com/es/especializacion/diseno-estructural-bim-acero</w:t>
+        <w:t xml:space="preserve">[enlace de WhatsApp de la academia con «BLACK» ya escrito, lo pone Ester]</w:t>
       </w:r>
     </w:p>
     <w:p>
@@ -34919,23 +35717,6 @@
           <w:sz w:val="18"/>
           <w:szCs w:val="18"/>
         </w:rPr>
-        <w:t xml:space="preserve">Cursos de bajo costo: https://funnel.dgdesignmodeling.com/naves-industriales-pro-page-574823</w:t>
-      </w:r>
-    </w:p>
-    <w:p>
-      <w:pPr>
-        <w:pBdr>
-          <w:left w:val="single" w:color="B9C6D3" w:sz="14" w:space="8"/>
-        </w:pBdr>
-        <w:shd w:fill="F7F9FB" w:val="clear"/>
-        <w:spacing w:after="0"/>
-      </w:pPr>
-      <w:r>
-        <w:rPr>
-          <w:rFonts w:ascii="Consolas" w:cs="Consolas" w:eastAsia="Consolas" w:hAnsi="Consolas"/>
-          <w:sz w:val="18"/>
-          <w:szCs w:val="18"/>
-        </w:rPr>
         <w:t xml:space="preserve"> </w:t>
       </w:r>
     </w:p>
@@ -34945,23 +35726,6 @@
           <w:left w:val="single" w:color="B9C6D3" w:sz="14" w:space="8"/>
         </w:pBdr>
         <w:shd w:fill="F7F9FB" w:val="clear"/>
-        <w:spacing w:after="0"/>
-      </w:pPr>
-      <w:r>
-        <w:rPr>
-          <w:rFonts w:ascii="Consolas" w:cs="Consolas" w:eastAsia="Consolas" w:hAnsi="Consolas"/>
-          <w:sz w:val="18"/>
-          <w:szCs w:val="18"/>
-        </w:rPr>
-        <w:t xml:space="preserve">Cierra el lunes 30 a las 23:59 (Ecuador). ¿Te queda alguna duda? Escríbenos y te contesta una</w:t>
-      </w:r>
-    </w:p>
-    <w:p>
-      <w:pPr>
-        <w:pBdr>
-          <w:left w:val="single" w:color="B9C6D3" w:sz="14" w:space="8"/>
-        </w:pBdr>
-        <w:shd w:fill="F7F9FB" w:val="clear"/>
         <w:spacing w:after="140"/>
       </w:pPr>
       <w:r>
@@ -34970,7 +35734,7 @@
           <w:sz w:val="18"/>
           <w:szCs w:val="18"/>
         </w:rPr>
-        <w:t xml:space="preserve">persona.</w:t>
+        <w:t xml:space="preserve">Cierra el lunes 30 a las 23:59 (Ecuador). ¿Te queda alguna duda? Te contesta una persona.</w:t>
       </w:r>
     </w:p>
     <w:p>
@@ -35285,7 +36049,7 @@
           <w:sz w:val="18"/>
           <w:szCs w:val="18"/>
         </w:rPr>
-        <w:t xml:space="preserve">Acero: https://designmodelingacademy.com/es/especializacion/diseno-estructural-bim-acero</w:t>
+        <w:t xml:space="preserve">Si todavía la quieres, escríbenos BLACK por WhatsApp antes de esa hora: [enlace de WhatsApp de</w:t>
       </w:r>
     </w:p>
     <w:p>
@@ -35302,7 +36066,7 @@
           <w:sz w:val="18"/>
           <w:szCs w:val="18"/>
         </w:rPr>
-        <w:t xml:space="preserve">Cursos de bajo costo: https://funnel.dgdesignmodeling.com/naves-industriales-pro-page-574823</w:t>
+        <w:t xml:space="preserve">la academia con «BLACK» ya escrito, lo pone Ester]</w:t>
       </w:r>
     </w:p>
     <w:p>
@@ -44238,7 +45002,7 @@
           <w:sz w:val="21"/>
           <w:szCs w:val="21"/>
         </w:rPr>
-        <w:t xml:space="preserve">Precio nunca en la historia: va por DM.</w:t>
+        <w:t xml:space="preserve">Precio nunca en la historia: va por DM o WhatsApp, con la mini landing de la oferta.</w:t>
       </w:r>
     </w:p>
     <w:p>
@@ -46401,7 +47165,7 @@
                 <w:sz w:val="18"/>
                 <w:szCs w:val="18"/>
               </w:rPr>
-              <w:t xml:space="preserve">RESPONDER CON «SUSTO» (se contesta a mano con el enlace del cupón).</w:t>
+              <w:t xml:space="preserve">RESPONDER CON «SUSTO» (se contesta a mano y se manda la oferta por WhatsApp).</w:t>
             </w:r>
           </w:p>
         </w:tc>
@@ -56937,7 +57701,7 @@
                 <w:sz w:val="18"/>
                 <w:szCs w:val="18"/>
               </w:rPr>
-              <w:t xml:space="preserve">RESPONDER CON «LISTA» (se contesta a mano con precio y enlace).</w:t>
+              <w:t xml:space="preserve">RESPONDER CON «LISTA» (se contesta a mano y se manda la oferta por WhatsApp).</w:t>
             </w:r>
           </w:p>
         </w:tc>
@@ -65181,7 +65945,7 @@
           <w:sz w:val="21"/>
           <w:szCs w:val="21"/>
         </w:rPr>
-        <w:t xml:space="preserve">⚠ Precio y cupón los confirma Dayana; Ester crea el cupón SUSTO en GHL antes del 30-oct.</w:t>
+        <w:t xml:space="preserve">⚠ REGLA DE NOVIEMBRE: el precio de la oferta NO va en público ni se enlaza la página vieja. Quien responde o escribe al WhatsApp recibe el precio y la mini landing de la oferta. Precio y forma de nombrarlo: los decide Ester.</w:t>
       </w:r>
     </w:p>
     <w:p>
@@ -65265,7 +66029,7 @@
           <w:sz w:val="18"/>
           <w:szCs w:val="18"/>
         </w:rPr>
-        <w:t xml:space="preserve">Para que no te pase, este fin de semana los cursos de bajo costo tienen precio de Halloween:</w:t>
+        <w:t xml:space="preserve">Para que no te pase, este fin de semana hay oferta de Halloween en los cursos de bajo costo. El</w:t>
       </w:r>
     </w:p>
     <w:p>
@@ -65282,7 +66046,7 @@
           <w:sz w:val="18"/>
           <w:szCs w:val="18"/>
         </w:rPr>
-        <w:t xml:space="preserve">[PRECIO HALLOWEEN, propuesta $19,99] con el cupón SUSTO.</w:t>
+        <w:t xml:space="preserve">más pedido es Naves Industriales PRO: una nave completa, paso a paso.</w:t>
       </w:r>
     </w:p>
     <w:p>
@@ -65316,7 +66080,7 @@
           <w:sz w:val="18"/>
           <w:szCs w:val="18"/>
         </w:rPr>
-        <w:t xml:space="preserve">El más pedido es Naves Industriales PRO: una nave completa, paso a paso.</w:t>
+        <w:t xml:space="preserve">La oferta no está en la web. Responde este correo con la palabra SUSTO o escríbenos por</w:t>
       </w:r>
     </w:p>
     <w:p>
@@ -65333,7 +66097,7 @@
           <w:sz w:val="18"/>
           <w:szCs w:val="18"/>
         </w:rPr>
-        <w:t xml:space="preserve">https://funnel.dgdesignmodeling.com/naves-industriales-pro-page-574823</w:t>
+        <w:t xml:space="preserve">WhatsApp ([enlace de WhatsApp de la academia con «SUSTO» ya escrito, lo pone Ester]) y te</w:t>
       </w:r>
     </w:p>
     <w:p>
@@ -65350,6 +66114,23 @@
           <w:sz w:val="18"/>
           <w:szCs w:val="18"/>
         </w:rPr>
+        <w:t xml:space="preserve">mandamos el precio y el enlace.</w:t>
+      </w:r>
+    </w:p>
+    <w:p>
+      <w:pPr>
+        <w:pBdr>
+          <w:left w:val="single" w:color="B9C6D3" w:sz="14" w:space="8"/>
+        </w:pBdr>
+        <w:shd w:fill="F7F9FB" w:val="clear"/>
+        <w:spacing w:after="0"/>
+      </w:pPr>
+      <w:r>
+        <w:rPr>
+          <w:rFonts w:ascii="Consolas" w:cs="Consolas" w:eastAsia="Consolas" w:hAnsi="Consolas"/>
+          <w:sz w:val="18"/>
+          <w:szCs w:val="18"/>
+        </w:rPr>
         <w:t xml:space="preserve"> </w:t>
       </w:r>
     </w:p>
@@ -65367,7 +66148,7 @@
           <w:sz w:val="18"/>
           <w:szCs w:val="18"/>
         </w:rPr>
-        <w:t xml:space="preserve">El cupón vence el domingo 1 de noviembre a las 23:59 (hora de Ecuador) y no se renueva.</w:t>
+        <w:t xml:space="preserve">Vence el domingo 1 de noviembre a las 23:59 (hora de Ecuador) y no se renueva.</w:t>
       </w:r>
     </w:p>
     <w:p>
@@ -65541,6 +66322,26 @@
     </w:tbl>
     <w:p>
       <w:pPr>
+        <w:spacing w:after="80"/>
+        <w:rPr>
+          <w:b/>
+          <w:bCs/>
+          <w:color w:val="A33B2A"/>
+        </w:rPr>
+      </w:pPr>
+      <w:r>
+        <w:rPr>
+          <w:b/>
+          <w:bCs/>
+          <w:color w:val="A33B2A"/>
+          <w:sz w:val="21"/>
+          <w:szCs w:val="21"/>
+        </w:rPr>
+        <w:t xml:space="preserve">⚠ REGLA DE NOVIEMBRE: el precio de la oferta NO va en público ni se enlaza la página vieja. Quien responde o escribe al WhatsApp recibe el precio y la mini landing de la oferta. Precio y forma de nombrarlo: los decide Ester.</w:t>
+      </w:r>
+    </w:p>
+    <w:p>
+      <w:pPr>
         <w:spacing w:after="50" w:before="150"/>
       </w:pPr>
       <w:r>
@@ -65569,7 +66370,7 @@
           <w:sz w:val="18"/>
           <w:szCs w:val="18"/>
         </w:rPr>
-        <w:t xml:space="preserve">Hoy a las 23:59 (hora de Ecuador) vence el cupón SUSTO.</w:t>
+        <w:t xml:space="preserve">Hoy a las 23:59 (hora de Ecuador) vence la oferta de Halloween en los cursos de bajo costo.</w:t>
       </w:r>
     </w:p>
     <w:p>
@@ -65603,7 +66404,7 @@
           <w:sz w:val="18"/>
           <w:szCs w:val="18"/>
         </w:rPr>
-        <w:t xml:space="preserve">Naves Industriales PRO y los demás cursos de bajo costo:</w:t>
+        <w:t xml:space="preserve">Si la quieres, responde SUSTO a este correo o escríbenos por WhatsApp ([enlace de WhatsApp de</w:t>
       </w:r>
     </w:p>
     <w:p>
@@ -65620,7 +66421,7 @@
           <w:sz w:val="18"/>
           <w:szCs w:val="18"/>
         </w:rPr>
-        <w:t xml:space="preserve">https://funnel.dgdesignmodeling.com/naves-industriales-pro-page-574823</w:t>
+        <w:t xml:space="preserve">la academia con «SUSTO» ya escrito, lo pone Ester]) antes de esa hora.</w:t>
       </w:r>
     </w:p>
     <w:p>
@@ -65654,7 +66455,7 @@
           <w:sz w:val="18"/>
           <w:szCs w:val="18"/>
         </w:rPr>
-        <w:t xml:space="preserve">Después vuelven a su precio normal.</w:t>
+        <w:t xml:space="preserve">Después no se renueva.</w:t>
       </w:r>
     </w:p>
     <w:p>
@@ -66897,7 +67698,7 @@
           <w:sz w:val="21"/>
           <w:szCs w:val="21"/>
         </w:rPr>
-        <w:t xml:space="preserve">⚠ Precios propuestos: los confirma Dayana. Si se usa la grabación del workshop, se manda aquí por 72 h.</w:t>
+        <w:t xml:space="preserve">⚠ Precios propuestos: los confirma Dayana. Si se usa la grabación del workshop, se manda aquí por 72 h. REGLA DE NOVIEMBRE: el precio de la oferta NO va en público ni se enlaza la página vieja. Quien responde o escribe al WhatsApp recibe el precio y la mini landing de la oferta. Precio y forma de nombrarlo: los decide Ester.</w:t>
       </w:r>
     </w:p>
     <w:p>
@@ -66981,7 +67782,7 @@
           <w:sz w:val="18"/>
           <w:szCs w:val="18"/>
         </w:rPr>
-        <w:t xml:space="preserve">Especialización en Acero con Tutor IA: [PRECIO BF, propuesta $179 en lugar de $225] + un curso</w:t>
+        <w:t xml:space="preserve">Entra la Especialización en Acero con Tutor IA (con un curso de bajo costo de regalo) y los</w:t>
       </w:r>
     </w:p>
     <w:p>
@@ -66998,7 +67799,7 @@
           <w:sz w:val="18"/>
           <w:szCs w:val="18"/>
         </w:rPr>
-        <w:t xml:space="preserve">de bajo costo de regalo.</w:t>
+        <w:t xml:space="preserve">cursos de bajo costo.</w:t>
       </w:r>
     </w:p>
     <w:p>
@@ -67032,7 +67833,7 @@
           <w:sz w:val="18"/>
           <w:szCs w:val="18"/>
         </w:rPr>
-        <w:t xml:space="preserve">Cursos de bajo costo: [PRECIO BF, propuesta pack de 3 por $49].</w:t>
+        <w:t xml:space="preserve">El precio no está en la web: es solo para la lista. Responde LISTA a este correo o escríbenos</w:t>
       </w:r>
     </w:p>
     <w:p>
@@ -67049,6 +67850,40 @@
           <w:sz w:val="18"/>
           <w:szCs w:val="18"/>
         </w:rPr>
+        <w:t xml:space="preserve">por WhatsApp ([enlace de WhatsApp de la academia con «LISTA» ya escrito, lo pone Ester]) y te</w:t>
+      </w:r>
+    </w:p>
+    <w:p>
+      <w:pPr>
+        <w:pBdr>
+          <w:left w:val="single" w:color="B9C6D3" w:sz="14" w:space="8"/>
+        </w:pBdr>
+        <w:shd w:fill="F7F9FB" w:val="clear"/>
+        <w:spacing w:after="0"/>
+      </w:pPr>
+      <w:r>
+        <w:rPr>
+          <w:rFonts w:ascii="Consolas" w:cs="Consolas" w:eastAsia="Consolas" w:hAnsi="Consolas"/>
+          <w:sz w:val="18"/>
+          <w:szCs w:val="18"/>
+        </w:rPr>
+        <w:t xml:space="preserve">mandamos el precio y el enlace.</w:t>
+      </w:r>
+    </w:p>
+    <w:p>
+      <w:pPr>
+        <w:pBdr>
+          <w:left w:val="single" w:color="B9C6D3" w:sz="14" w:space="8"/>
+        </w:pBdr>
+        <w:shd w:fill="F7F9FB" w:val="clear"/>
+        <w:spacing w:after="0"/>
+      </w:pPr>
+      <w:r>
+        <w:rPr>
+          <w:rFonts w:ascii="Consolas" w:cs="Consolas" w:eastAsia="Consolas" w:hAnsi="Consolas"/>
+          <w:sz w:val="18"/>
+          <w:szCs w:val="18"/>
+        </w:rPr>
         <w:t xml:space="preserve"> </w:t>
       </w:r>
     </w:p>
@@ -67075,7 +67910,7 @@
           <w:left w:val="single" w:color="B9C6D3" w:sz="14" w:space="8"/>
         </w:pBdr>
         <w:shd w:fill="F7F9FB" w:val="clear"/>
-        <w:spacing w:after="0"/>
+        <w:spacing w:after="140"/>
       </w:pPr>
       <w:r>
         <w:rPr>
@@ -67084,40 +67919,6 @@
           <w:szCs w:val="18"/>
         </w:rPr>
         <w:t xml:space="preserve">https://designmodelingacademy.com/es/especializacion/diseno-estructural-bim-acero</w:t>
-      </w:r>
-    </w:p>
-    <w:p>
-      <w:pPr>
-        <w:pBdr>
-          <w:left w:val="single" w:color="B9C6D3" w:sz="14" w:space="8"/>
-        </w:pBdr>
-        <w:shd w:fill="F7F9FB" w:val="clear"/>
-        <w:spacing w:after="0"/>
-      </w:pPr>
-      <w:r>
-        <w:rPr>
-          <w:rFonts w:ascii="Consolas" w:cs="Consolas" w:eastAsia="Consolas" w:hAnsi="Consolas"/>
-          <w:sz w:val="18"/>
-          <w:szCs w:val="18"/>
-        </w:rPr>
-        <w:t xml:space="preserve"> </w:t>
-      </w:r>
-    </w:p>
-    <w:p>
-      <w:pPr>
-        <w:pBdr>
-          <w:left w:val="single" w:color="B9C6D3" w:sz="14" w:space="8"/>
-        </w:pBdr>
-        <w:shd w:fill="F7F9FB" w:val="clear"/>
-        <w:spacing w:after="140"/>
-      </w:pPr>
-      <w:r>
-        <w:rPr>
-          <w:rFonts w:ascii="Consolas" w:cs="Consolas" w:eastAsia="Consolas" w:hAnsi="Consolas"/>
-          <w:sz w:val="18"/>
-          <w:szCs w:val="18"/>
-        </w:rPr>
-        <w:t xml:space="preserve">Si quieres hablar con una persona antes de decidir, responde este correo.</w:t>
       </w:r>
     </w:p>
     <w:p>
@@ -67630,7 +68431,7 @@
           <w:sz w:val="21"/>
           <w:szCs w:val="21"/>
         </w:rPr>
-        <w:t xml:space="preserve">⚠ El Máster no lleva precio. El bono lo confirma Dayana (propuesta: Acero con Tutor IA y Naves PRO).</w:t>
+        <w:t xml:space="preserve">⚠ El Máster no lleva precio. El bono lo confirma Dayana (propuesta: Acero con Tutor IA y Naves PRO). REGLA DE NOVIEMBRE: el precio de la oferta NO va en público ni se enlaza la página vieja. Quien responde o escribe al WhatsApp recibe el precio y la mini landing de la oferta. Precio y forma de nombrarlo: los decide Ester.</w:t>
       </w:r>
     </w:p>
     <w:p>
@@ -67697,7 +68498,7 @@
           <w:sz w:val="18"/>
           <w:szCs w:val="18"/>
         </w:rPr>
-        <w:t xml:space="preserve">Especialización en Acero con Tutor IA: [PRECIO BF, propuesta $179] (normal $225).</w:t>
+        <w:t xml:space="preserve">Especialización en Acero con Tutor IA y cursos de bajo costo, con precio de Black Friday.</w:t>
       </w:r>
     </w:p>
     <w:p>
@@ -67731,7 +68532,41 @@
           <w:sz w:val="18"/>
           <w:szCs w:val="18"/>
         </w:rPr>
-        <w:t xml:space="preserve">Cursos de bajo costo: [PRECIO BF, propuesta pack de 3 por $49].</w:t>
+        <w:t xml:space="preserve">La oferta no está en la web: responde BLACK a este correo o escríbenos por WhatsApp ([enlace de</w:t>
+      </w:r>
+    </w:p>
+    <w:p>
+      <w:pPr>
+        <w:pBdr>
+          <w:left w:val="single" w:color="B9C6D3" w:sz="14" w:space="8"/>
+        </w:pBdr>
+        <w:shd w:fill="F7F9FB" w:val="clear"/>
+        <w:spacing w:after="0"/>
+      </w:pPr>
+      <w:r>
+        <w:rPr>
+          <w:rFonts w:ascii="Consolas" w:cs="Consolas" w:eastAsia="Consolas" w:hAnsi="Consolas"/>
+          <w:sz w:val="18"/>
+          <w:szCs w:val="18"/>
+        </w:rPr>
+        <w:t xml:space="preserve">WhatsApp de la academia con «BLACK» ya escrito, lo pone Ester]) y te mandamos el precio y el</w:t>
+      </w:r>
+    </w:p>
+    <w:p>
+      <w:pPr>
+        <w:pBdr>
+          <w:left w:val="single" w:color="B9C6D3" w:sz="14" w:space="8"/>
+        </w:pBdr>
+        <w:shd w:fill="F7F9FB" w:val="clear"/>
+        <w:spacing w:after="0"/>
+      </w:pPr>
+      <w:r>
+        <w:rPr>
+          <w:rFonts w:ascii="Consolas" w:cs="Consolas" w:eastAsia="Consolas" w:hAnsi="Consolas"/>
+          <w:sz w:val="18"/>
+          <w:szCs w:val="18"/>
+        </w:rPr>
+        <w:t xml:space="preserve">enlace.</w:t>
       </w:r>
     </w:p>
     <w:p>
@@ -68346,7 +69181,7 @@
           <w:sz w:val="21"/>
           <w:szCs w:val="21"/>
         </w:rPr>
-        <w:t xml:space="preserve">⚠ Ecuador: silencio electoral del 27 al 29 (no aplica a comunicación comercial, pero se baja la pauta en Ecuador).</w:t>
+        <w:t xml:space="preserve">⚠ Ecuador: silencio electoral del 27 al 29 (no aplica a comunicación comercial, pero se baja la pauta en Ecuador). REGLA DE NOVIEMBRE: el precio de la oferta NO va en público ni se enlaza la página vieja. Quien responde o escribe al WhatsApp recibe el precio y la mini landing de la oferta. Precio y forma de nombrarlo: los decide Ester.</w:t>
       </w:r>
     </w:p>
     <w:p>
@@ -68379,7 +69214,7 @@
           <w:sz w:val="18"/>
           <w:szCs w:val="18"/>
         </w:rPr>
-        <w:t xml:space="preserve">Hoy es Black Friday. Especialización en Acero con Tutor IA: [PRECIO BF] (normal $225). Cursos</w:t>
+        <w:t xml:space="preserve">Hoy es Black Friday. Si lo tuyo es diseñar acero en software, es el mejor momento del año para</w:t>
       </w:r>
     </w:p>
     <w:p>
@@ -68396,7 +69231,7 @@
           <w:sz w:val="18"/>
           <w:szCs w:val="18"/>
         </w:rPr>
-        <w:t xml:space="preserve">de bajo costo: [PRECIO BF].</w:t>
+        <w:t xml:space="preserve">empezar la Especialización en Acero con Tutor IA.</w:t>
       </w:r>
     </w:p>
     <w:p>
@@ -68430,7 +69265,41 @@
           <w:sz w:val="18"/>
           <w:szCs w:val="18"/>
         </w:rPr>
-        <w:t xml:space="preserve">Temario: https://designmodelingacademy.com/es/especializacion/diseno-estructural-bim-acero</w:t>
+        <w:t xml:space="preserve">Responde BLACK a este correo o escríbenos por WhatsApp ([enlace de WhatsApp de la academia con</w:t>
+      </w:r>
+    </w:p>
+    <w:p>
+      <w:pPr>
+        <w:pBdr>
+          <w:left w:val="single" w:color="B9C6D3" w:sz="14" w:space="8"/>
+        </w:pBdr>
+        <w:shd w:fill="F7F9FB" w:val="clear"/>
+        <w:spacing w:after="0"/>
+      </w:pPr>
+      <w:r>
+        <w:rPr>
+          <w:rFonts w:ascii="Consolas" w:cs="Consolas" w:eastAsia="Consolas" w:hAnsi="Consolas"/>
+          <w:sz w:val="18"/>
+          <w:szCs w:val="18"/>
+        </w:rPr>
+        <w:t xml:space="preserve">«BLACK» ya escrito, lo pone Ester]) y te mandamos el precio y el enlace. Lo mismo para los</w:t>
+      </w:r>
+    </w:p>
+    <w:p>
+      <w:pPr>
+        <w:pBdr>
+          <w:left w:val="single" w:color="B9C6D3" w:sz="14" w:space="8"/>
+        </w:pBdr>
+        <w:shd w:fill="F7F9FB" w:val="clear"/>
+        <w:spacing w:after="0"/>
+      </w:pPr>
+      <w:r>
+        <w:rPr>
+          <w:rFonts w:ascii="Consolas" w:cs="Consolas" w:eastAsia="Consolas" w:hAnsi="Consolas"/>
+          <w:sz w:val="18"/>
+          <w:szCs w:val="18"/>
+        </w:rPr>
+        <w:t xml:space="preserve">cursos de bajo costo.</w:t>
       </w:r>
     </w:p>
     <w:p>
@@ -68638,6 +69507,26 @@
     </w:tbl>
     <w:p>
       <w:pPr>
+        <w:spacing w:after="80"/>
+        <w:rPr>
+          <w:b/>
+          <w:bCs/>
+          <w:color w:val="A33B2A"/>
+        </w:rPr>
+      </w:pPr>
+      <w:r>
+        <w:rPr>
+          <w:b/>
+          <w:bCs/>
+          <w:color w:val="A33B2A"/>
+          <w:sz w:val="21"/>
+          <w:szCs w:val="21"/>
+        </w:rPr>
+        <w:t xml:space="preserve">⚠ REGLA DE NOVIEMBRE: el precio de la oferta NO va en público ni se enlaza la página vieja. Quien responde o escribe al WhatsApp recibe el precio y la mini landing de la oferta. Precio y forma de nombrarlo: los decide Ester.</w:t>
+      </w:r>
+    </w:p>
+    <w:p>
+      <w:pPr>
         <w:spacing w:after="50" w:before="150"/>
       </w:pPr>
       <w:r>
@@ -68700,24 +69589,7 @@
           <w:sz w:val="18"/>
           <w:szCs w:val="18"/>
         </w:rPr>
-        <w:t xml:space="preserve">Especialización en Acero con Tutor IA: [PRECIO BF]. Cursos de bajo costo: [PRECIO BF].</w:t>
-      </w:r>
-    </w:p>
-    <w:p>
-      <w:pPr>
-        <w:pBdr>
-          <w:left w:val="single" w:color="B9C6D3" w:sz="14" w:space="8"/>
-        </w:pBdr>
-        <w:shd w:fill="F7F9FB" w:val="clear"/>
-        <w:spacing w:after="0"/>
-      </w:pPr>
-      <w:r>
-        <w:rPr>
-          <w:rFonts w:ascii="Consolas" w:cs="Consolas" w:eastAsia="Consolas" w:hAnsi="Consolas"/>
-          <w:sz w:val="18"/>
-          <w:szCs w:val="18"/>
-        </w:rPr>
-        <w:t xml:space="preserve"> </w:t>
+        <w:t xml:space="preserve">Si todavía la quieres, responde BLACK a este correo o escríbenos por WhatsApp ([enlace de</w:t>
       </w:r>
     </w:p>
     <w:p>
@@ -68734,7 +69606,7 @@
           <w:sz w:val="18"/>
           <w:szCs w:val="18"/>
         </w:rPr>
-        <w:t xml:space="preserve">Temario: https://designmodelingacademy.com/es/especializacion/diseno-estructural-bim-acero</w:t>
+        <w:t xml:space="preserve">WhatsApp de la academia con «BLACK» ya escrito, lo pone Ester]) antes de esa hora.</w:t>
       </w:r>
     </w:p>
     <w:p>

</xml_diff>